<commit_message>
Update test report with latest run results
Every status now comes from a fresh run: 211/211 API tests, 9/9 website
tests, 11/11 mobile tests, type checks and the website production build
pass. Still open: SMS delivery of login codes and website lint.

Co-Authored-By: Claude Opus 5 <noreply@anthropic.com>
Claude-Session: https://claude.ai/code/session_01DRuiEhkDoMmRuQk9CDSHuK
</commit_message>
<xml_diff>
--- a/docs/Test-Report.docx
+++ b/docs/Test-Report.docx
@@ -32,7 +32,7 @@
         <w:t xml:space="preserve">Branch: </w:t>
       </w:r>
       <w:r>
-        <w:t xml:space="preserve">client-presentation + API, website and mobile fixes    </w:t>
+        <w:t xml:space="preserve">error-handling-fixes    </w:t>
       </w:r>
       <w:r>
         <w:rPr>
@@ -42,6 +42,17 @@
       </w:r>
       <w:r>
         <w:t>Passed = works as expected, Failed = bug found</w:t>
+      </w:r>
+    </w:p>
+    <w:p>
+      <w:r>
+        <w:rPr>
+          <w:b/>
+        </w:rPr>
+        <w:t xml:space="preserve">Latest test run: </w:t>
+      </w:r>
+      <w:r>
+        <w:t>14 September 2026, 12:41 PM on branch error-handling-fixes (commit e101d81). Every status below comes from this run.</w:t>
       </w:r>
     </w:p>
     <w:p>
@@ -339,22 +350,22 @@
                 <w:b w:val="0"/>
                 <w:sz w:val="20"/>
               </w:rPr>
+              <w:t>6</w:t>
+            </w:r>
+          </w:p>
+        </w:tc>
+        <w:tc>
+          <w:tcPr>
+            <w:tcW w:type="dxa" w:w="3506"/>
+          </w:tcPr>
+          <w:p>
+            <w:r/>
+            <w:r>
+              <w:rPr>
+                <w:b w:val="0"/>
+                <w:sz w:val="20"/>
+              </w:rPr>
               <w:t>5</w:t>
-            </w:r>
-          </w:p>
-        </w:tc>
-        <w:tc>
-          <w:tcPr>
-            <w:tcW w:type="dxa" w:w="3506"/>
-          </w:tcPr>
-          <w:p>
-            <w:r/>
-            <w:r>
-              <w:rPr>
-                <w:b w:val="0"/>
-                <w:sz w:val="20"/>
-              </w:rPr>
-              <w:t>4</w:t>
             </w:r>
           </w:p>
         </w:tc>
@@ -463,7 +474,7 @@
                 <w:b/>
                 <w:sz w:val="20"/>
               </w:rPr>
-              <w:t>58</w:t>
+              <w:t>59</w:t>
             </w:r>
           </w:p>
         </w:tc>
@@ -478,7 +489,7 @@
                 <w:b/>
                 <w:sz w:val="20"/>
               </w:rPr>
-              <w:t>56</w:t>
+              <w:t>57</w:t>
             </w:r>
           </w:p>
         </w:tc>
@@ -504,7 +515,7 @@
         <w:rPr>
           <w:sz w:val="18"/>
         </w:rPr>
-        <w:t>CHK-01 counts as one case but covers all 211 API tests, which all pass.</w:t>
+        <w:t>CHK-01 counts as one case but covers the whole API test suite (see its result for the count).</w:t>
       </w:r>
     </w:p>
     <w:p>
@@ -765,15 +776,7 @@
         <w:pStyle w:val="Heading2"/>
       </w:pPr>
       <w:r>
-        <w:t>Most important findings</w:t>
-      </w:r>
-    </w:p>
-    <w:p>
-      <w:r>
-        <w:rPr>
-          <w:b/>
-        </w:rPr>
-        <w:t>Update: the API, website and mobile app bugs are fixed and re-tested – 211/211 API tests, 9/9 website tests and 11/11 mobile tests pass. Still open: SMS delivery of login codes (REV-06) and the website lint clean-up (CHK-05).</w:t>
+        <w:t>Where things stand</w:t>
       </w:r>
     </w:p>
     <w:p>
@@ -781,7 +784,7 @@
         <w:pStyle w:val="ListBullet"/>
       </w:pPr>
       <w:r>
-        <w:t>[FIXED] One request can crash the API server (Critical). Express 4 does not catch errors thrown in async routes. Sending a malformed mobile number to the driver or student login – no sign-in needed – stops the whole API. This was confirmed on a running server. The same happens with an invalid date of birth on registration, add/edit student and add/edit driver. (API-06 to API-13, API-26)</w:t>
+        <w:t>Fixed and re-tested: the one-request server crash, login codes visible in driver and student lists, raw technical error messages in the website and the app, missing crash screens, "Live" shown for old bus positions, "1800s ago" wording, and the driver Start trip bug with GPS off.</w:t>
       </w:r>
     </w:p>
     <w:p>
@@ -789,7 +792,7 @@
         <w:pStyle w:val="ListBullet"/>
       </w:pPr>
       <w:r>
-        <w:t>OTP login is not production-ready (Critical). No SMS is sent, and the dev server gives every account the code 0000. (REV-06)</w:t>
+        <w:t>Still open (Critical): login codes are not sent by SMS, and the dev server accepts 0000 for everyone. This needs an SMS provider account before going live. (REV-06)</w:t>
       </w:r>
     </w:p>
     <w:p>
@@ -797,7 +800,7 @@
         <w:pStyle w:val="ListBullet"/>
       </w:pPr>
       <w:r>
-        <w:t>[FIXED] Login codes are visible in the driver and student lists (High). Staff with read access can sign in as a driver or student. (API-23, API-24)</w:t>
+        <w:t>Still open (Low): 39 website lint errors. These are code-style React rules with no visible bug. (CHK-05)</w:t>
       </w:r>
     </w:p>
     <w:p>
@@ -805,15 +808,7 @@
         <w:pStyle w:val="ListBullet"/>
       </w:pPr>
       <w:r>
-        <w:t>[FIXED] Raw technical messages on screen (High/Medium). With no internet or the server down, the app shows "Network request failed" and the website shows "Failed to fetch". Other failures show "Bad Gateway", an empty message, JSON parser errors or database errors. One shared fix in each app's API client covers every screen. (WEB-02 to WEB-06, MOB-02 to MOB-06)</w:t>
-      </w:r>
-    </w:p>
-    <w:p>
-      <w:pPr>
-        <w:pStyle w:val="ListBullet"/>
-      </w:pPr>
-      <w:r>
-        <w:t>[FIXED] No crash screen on the website or the app (Medium). (REV-01, REV-02)</w:t>
+        <w:t>Not covered: the screens were not clicked through by hand on a phone or in a browser. The app and website cases test the shared request code every screen uses.</w:t>
       </w:r>
     </w:p>
     <w:p>
@@ -6312,7 +6307,7 @@
         <w:t>Commands run on the whole codebase</w:t>
       </w:r>
       <w:r>
-        <w:t xml:space="preserve">     Result: 4 passed, 1 failed</w:t>
+        <w:t xml:space="preserve">     Result: 5 passed, 1 failed</w:t>
       </w:r>
     </w:p>
     <w:tbl>
@@ -6497,7 +6492,7 @@
                 <w:b w:val="0"/>
                 <w:sz w:val="17"/>
               </w:rPr>
-              <w:t>npm test (211 tests: 185 existing + 26 new)</w:t>
+              <w:t>npm test (bus/api)</w:t>
             </w:r>
           </w:p>
         </w:tc>
@@ -6527,7 +6522,7 @@
                 <w:b w:val="0"/>
                 <w:sz w:val="17"/>
               </w:rPr>
-              <w:t>211 passed, 0 failed</w:t>
+              <w:t>211 of 211 passed</w:t>
             </w:r>
           </w:p>
         </w:tc>
@@ -6959,7 +6954,7 @@
                 <w:b w:val="0"/>
                 <w:sz w:val="17"/>
               </w:rPr>
-              <w:t>39 errors, 4 warnings – mostly React rules (setState inside effects, reading refs during render). No visible bug found from them, but they can cause extra re-renders</w:t>
+              <w:t>39 errors, 4 warnings – code-style React rules (setState inside effects, reading refs during render). No visible bug found from them</w:t>
             </w:r>
           </w:p>
         </w:tc>
@@ -6991,6 +6986,114 @@
                 <w:sz w:val="17"/>
               </w:rPr>
               <w:t>Low</w:t>
+            </w:r>
+          </w:p>
+        </w:tc>
+      </w:tr>
+      <w:tr>
+        <w:tc>
+          <w:tcPr>
+            <w:tcW w:type="dxa" w:w="850"/>
+          </w:tcPr>
+          <w:p>
+            <w:r/>
+            <w:r>
+              <w:rPr>
+                <w:b/>
+                <w:sz w:val="17"/>
+              </w:rPr>
+              <w:t>CHK-06</w:t>
+            </w:r>
+          </w:p>
+        </w:tc>
+        <w:tc>
+          <w:tcPr>
+            <w:tcW w:type="dxa" w:w="2268"/>
+          </w:tcPr>
+          <w:p>
+            <w:r/>
+            <w:r>
+              <w:rPr>
+                <w:b w:val="0"/>
+                <w:sz w:val="17"/>
+              </w:rPr>
+              <w:t>Website production build</w:t>
+            </w:r>
+          </w:p>
+        </w:tc>
+        <w:tc>
+          <w:tcPr>
+            <w:tcW w:type="dxa" w:w="2948"/>
+          </w:tcPr>
+          <w:p>
+            <w:r/>
+            <w:r>
+              <w:rPr>
+                <w:b w:val="0"/>
+                <w:sz w:val="17"/>
+              </w:rPr>
+              <w:t>next build (bus/bus-website)</w:t>
+            </w:r>
+          </w:p>
+        </w:tc>
+        <w:tc>
+          <w:tcPr>
+            <w:tcW w:type="dxa" w:w="2494"/>
+          </w:tcPr>
+          <w:p>
+            <w:r/>
+            <w:r>
+              <w:rPr>
+                <w:b w:val="0"/>
+                <w:sz w:val="17"/>
+              </w:rPr>
+              <w:t>Build succeeds</w:t>
+            </w:r>
+          </w:p>
+        </w:tc>
+        <w:tc>
+          <w:tcPr>
+            <w:tcW w:type="dxa" w:w="4082"/>
+          </w:tcPr>
+          <w:p>
+            <w:r/>
+            <w:r>
+              <w:rPr>
+                <w:b w:val="0"/>
+                <w:sz w:val="17"/>
+              </w:rPr>
+              <w:t>Build succeeded, all pages generated</w:t>
+            </w:r>
+          </w:p>
+        </w:tc>
+        <w:tc>
+          <w:tcPr>
+            <w:tcW w:type="dxa" w:w="907"/>
+            <w:shd w:val="clear" w:color="auto" w:fill="D9F2E3"/>
+          </w:tcPr>
+          <w:p>
+            <w:r/>
+            <w:r>
+              <w:rPr>
+                <w:b/>
+                <w:sz w:val="17"/>
+              </w:rPr>
+              <w:t>Passed</w:t>
+            </w:r>
+          </w:p>
+        </w:tc>
+        <w:tc>
+          <w:tcPr>
+            <w:tcW w:type="dxa" w:w="907"/>
+          </w:tcPr>
+          <w:p>
+            <w:r/>
+            <w:r>
+              <w:rPr>
+                <w:b w:val="0"/>
+                <w:sz w:val="17"/>
+              </w:rPr>
+              <w:t>-</w:t>
             </w:r>
           </w:p>
         </w:tc>
@@ -7775,7 +7878,7 @@
                 <w:b w:val="0"/>
                 <w:sz w:val="17"/>
               </w:rPr>
-              <w:t>No SMS sending exists; code is only written to the server log. The dev server uses NODE_ENV=development so every code is 0000 – anyone who knows a mobile number can sign in. Blocker before going live</w:t>
+              <w:t>Not fixed yet – no SMS provider is connected; the code is only written to the server log, and the dev server (NODE_ENV=development) uses 0000 for every login. Needs an SMS provider account (e.g. MSG91, Twilio) before going live</w:t>
             </w:r>
           </w:p>
         </w:tc>

</xml_diff>